<commit_message>
Fix minor issues from classroom exercises tong-hop-bai-lam
</commit_message>
<xml_diff>
--- a/bai-tap-nhom/buoi-1/bai-tap-tai-lop/tong-hop-bai-lam/25210152_25210242_25210146_25210179.docx
+++ b/bai-tap-nhom/buoi-1/bai-tap-tai-lop/tong-hop-bai-lam/25210152_25210242_25210146_25210179.docx
@@ -94,17 +94,7 @@
           <w:sz w:val="26"/>
           <w:szCs w:val="26"/>
         </w:rPr>
-        <w:t>Who are the actors in this process</w:t>
-      </w:r>
-      <w:r>
-        <w:rPr>
-          <w:rFonts w:ascii="Times New Roman" w:hAnsi="Times New Roman" w:cs="Times New Roman"/>
-          <w:b/>
-          <w:bCs/>
-          <w:sz w:val="26"/>
-          <w:szCs w:val="26"/>
-        </w:rPr>
-        <w:t>?</w:t>
+        <w:t>Who are the actors in this process?</w:t>
       </w:r>
     </w:p>
     <w:p>
@@ -245,17 +235,7 @@
           <w:sz w:val="26"/>
           <w:szCs w:val="26"/>
         </w:rPr>
-        <w:t>Which actors can be considered as customers in this process</w:t>
-      </w:r>
-      <w:r>
-        <w:rPr>
-          <w:rFonts w:ascii="Times New Roman" w:hAnsi="Times New Roman" w:cs="Times New Roman"/>
-          <w:b/>
-          <w:bCs/>
-          <w:sz w:val="26"/>
-          <w:szCs w:val="26"/>
-        </w:rPr>
-        <w:t>?</w:t>
+        <w:t>Which actors can be considered as customers in this process?</w:t>
       </w:r>
     </w:p>
     <w:p>
@@ -374,6 +354,8 @@
         <w:jc w:val="both"/>
         <w:rPr>
           <w:rFonts w:ascii="Times New Roman" w:hAnsi="Times New Roman" w:cs="Times New Roman"/>
+          <w:b/>
+          <w:bCs/>
           <w:sz w:val="26"/>
           <w:szCs w:val="26"/>
         </w:rPr>
@@ -602,7 +584,7 @@
         <v:path o:extrusionok="f" gradientshapeok="t" o:connecttype="rect"/>
         <o:lock v:ext="edit" aspectratio="t"/>
       </v:shapetype>
-      <v:shape id="_x0000_i1085" type="#_x0000_t75" style="width:11.25pt;height:11.25pt" o:bullet="t">
+      <v:shape id="_x0000_i1030" type="#_x0000_t75" style="width:11.25pt;height:11.25pt" o:bullet="t">
         <v:imagedata r:id="rId1" o:title="mso34F0"/>
       </v:shape>
     </w:pict>
@@ -1773,6 +1755,7 @@
   <w:style w:type="character" w:default="1" w:styleId="DefaultParagraphFont">
     <w:name w:val="Default Paragraph Font"/>
     <w:uiPriority w:val="1"/>
+    <w:semiHidden/>
     <w:unhideWhenUsed/>
   </w:style>
   <w:style w:type="table" w:default="1" w:styleId="TableNormal">

</xml_diff>

<commit_message>
Fix minor issues classroom exercise tong-hop-bai-lam
</commit_message>
<xml_diff>
--- a/bai-tap-nhom/buoi-1/bai-tap-tai-lop/tong-hop-bai-lam/25210152_25210242_25210146_25210179.docx
+++ b/bai-tap-nhom/buoi-1/bai-tap-tai-lop/tong-hop-bai-lam/25210152_25210242_25210146_25210179.docx
@@ -548,7 +548,21 @@
           <w:sz w:val="26"/>
           <w:szCs w:val="26"/>
         </w:rPr>
-        <w:t>Tranh chấp / Trì hoãn thanh toán: Có sự sai lệch thông tin giữa Đơn đặt hàng (Purchasing Order), Thông báo giao hàng (Shipment Notice) và Hóa đơn từ phía Vendor, dẫn đến việc Bộ phận kế toán phải giữ lại khoản thanh toán để đối soát và giải quyết tranh chấp.</w:t>
+        <w:t>Tranh chấp / Trì hoãn thanh toán: Có sự sai lệch thông tin giữa Đơn đặt hàng (Purchasing Order), Thông báo giao hàng (Shipment Notice) và Hóa đơn từ phía Vendor, dẫn đến việc Bộ phận kế toán phải giữ lại khoản thanh toán để đối soát và giải quyết tranh chấ</w:t>
+      </w:r>
+      <w:r>
+        <w:rPr>
+          <w:sz w:val="26"/>
+          <w:szCs w:val="26"/>
+        </w:rPr>
+        <w:t>p</w:t>
+      </w:r>
+      <w:r>
+        <w:rPr>
+          <w:sz w:val="26"/>
+          <w:szCs w:val="26"/>
+        </w:rPr>
+        <w:t>.</w:t>
       </w:r>
     </w:p>
     <w:sectPr>
@@ -584,7 +598,7 @@
         <v:path o:extrusionok="f" gradientshapeok="t" o:connecttype="rect"/>
         <o:lock v:ext="edit" aspectratio="t"/>
       </v:shapetype>
-      <v:shape id="_x0000_i1030" type="#_x0000_t75" style="width:11.25pt;height:11.25pt" o:bullet="t">
+      <v:shape id="_x0000_i1028" type="#_x0000_t75" style="width:11.25pt;height:11.25pt" o:bullet="t">
         <v:imagedata r:id="rId1" o:title="mso34F0"/>
       </v:shape>
     </w:pict>

</xml_diff>